<commit_message>
Revise cover letter for clearer scientific flow and journal format.
</commit_message>
<xml_diff>
--- a/JNeurol_submission/Cover_letter.docx
+++ b/JNeurol_submission/Cover_letter.docx
@@ -11,38 +11,15 @@
         <w:t>Dear Editor-in-Chief,</w:t>
       </w:r>
     </w:p>
-    <w:p/>
     <w:p>
       <w:r>
         <w:rPr>
           <w:rFonts w:ascii="Times New Roman" w:hAnsi="Times New Roman"/>
           <w:sz w:val="24"/>
         </w:rPr>
-        <w:t>We submit for your consideration an Original Communication entitled:</w:t>
+        <w:t>Please consider the enclosed manuscript for publication as an Original Communication in the Journal of Neurology.</w:t>
       </w:r>
     </w:p>
-    <w:p/>
-    <w:p>
-      <w:r>
-        <w:rPr>
-          <w:rFonts w:ascii="Times New Roman" w:hAnsi="Times New Roman"/>
-          <w:i/>
-          <w:sz w:val="24"/>
-        </w:rPr>
-        <w:t>“Progression from myeloneuropathy to cerebral disease in men with X-linked adrenoleukodystrophy studied using a Human Phenotype Ontology-based approach.”</w:t>
-      </w:r>
-    </w:p>
-    <w:p/>
-    <w:p>
-      <w:r>
-        <w:rPr>
-          <w:rFonts w:ascii="Times New Roman" w:hAnsi="Times New Roman"/>
-          <w:sz w:val="24"/>
-        </w:rPr>
-        <w:t>All authors have approved the manuscript and agree with its submission to the Journal of Neurology. The work has not been published previously and is not under consideration elsewhere.</w:t>
-      </w:r>
-    </w:p>
-    <w:p/>
     <w:p>
       <w:r>
         <w:rPr>
@@ -50,7 +27,7 @@
           <w:b/>
           <w:sz w:val="24"/>
         </w:rPr>
-        <w:t>Clinical problem and relevance for your readership</w:t>
+        <w:t>Title: Progression from myeloneuropathy to cerebral disease in men with X-linked adrenoleukodystrophy studied using a Human Phenotype Ontology-based approach</w:t>
       </w:r>
     </w:p>
     <w:p>
@@ -59,18 +36,7 @@
           <w:rFonts w:ascii="Times New Roman" w:hAnsi="Times New Roman"/>
           <w:sz w:val="24"/>
         </w:rPr>
-        <w:t>In men with X-linked adrenoleukodystrophy (X-ALD), inflammatory cerebral disease can follow a myeloneuropathic presentation, yet the risk and timing of this transition remain uncertain in routine care. Counselling, surveillance, and trial design therefore depend on natural history estimates that are still sparse and difficult to compare across centres. The Journal of Neurology is an appropriate forum because the question is directly relevant to clinical neurology, prognostication, and the longitudinal assessment of rare white matter disorders.</w:t>
-      </w:r>
-    </w:p>
-    <w:p/>
-    <w:p>
-      <w:r>
-        <w:rPr>
-          <w:rFonts w:ascii="Times New Roman" w:hAnsi="Times New Roman"/>
-          <w:b/>
-          <w:sz w:val="24"/>
-        </w:rPr>
-        <w:t>What this paper adds</w:t>
+        <w:t>The manuscript has not been published elsewhere and is not under consideration by another journal. All authors have read and approved the final version and agree with its submission.</w:t>
       </w:r>
     </w:p>
     <w:p>
@@ -79,18 +45,7 @@
           <w:rFonts w:ascii="Times New Roman" w:hAnsi="Times New Roman"/>
           <w:sz w:val="24"/>
         </w:rPr>
-        <w:t>Using the Leipzig leukodystrophy registry, we estimated the cumulative incidence of a first physician-recorded cerebral adrenoleukodystrophy (cerebral ALD) event in men who presented with myelopathic disease and had no cerebral ALD at their first dated visit. Among 67 men at risk (median follow-up 86 months; 20 events), cumulative incidence was 6.5% at 3 years, 10.2% at 5 years, and 24.3% (95% CI 13.8 to 40.7) at 10 years. We describe baseline and HPO-coded findings in the full cohort and discuss how these results relate to earlier cohorts. We state clearly that the analyses are exploratory and hypothesis-generating and that magnetic resonance imaging surveillance remains essential.</w:t>
-      </w:r>
-    </w:p>
-    <w:p/>
-    <w:p>
-      <w:r>
-        <w:rPr>
-          <w:rFonts w:ascii="Times New Roman" w:hAnsi="Times New Roman"/>
-          <w:b/>
-          <w:sz w:val="24"/>
-        </w:rPr>
-        <w:t>Original HPO Symptom Grouping Dataset</w:t>
+        <w:t>Men with X-linked adrenoleukodystrophy (X-ALD) may remain on a myeloneuropathic trajectory for years before inflammatory cerebral adrenoleukodystrophy (cerebral ALD) is recognised. In clinical practice, estimates of when and how often this transition occurs remain inconsistent, which complicates counselling and the design of surveillance and natural history studies. We address this question using longitudinal data from the Leipzig leukodystrophy registry (REDCap), a setting in which neurologists record disease manifestation and Human Phenotype Ontology (HPO)-coded examination findings at repeated visits.</w:t>
       </w:r>
     </w:p>
     <w:p>
@@ -99,18 +54,7 @@
           <w:rFonts w:ascii="Times New Roman" w:hAnsi="Times New Roman"/>
           <w:sz w:val="24"/>
         </w:rPr>
-        <w:t>The principal methodological contribution is a new, study-specific HPO Symptom Grouping Dataset (Online Resource 1), developed by the clinical authors to map registry examination items to 133 distinct HPO terms grouped into myelopathic and cerebral subgroups with neuroanatomical localisation. To our knowledge, no prior study has used standardised HPO-coded phenotypes to analyse progression from myeloneuropathy to cerebral disease in leukodystrophy. This dataset is original to the present work and is intended to support reproducible, multicentre natural history research; it is also available with the submission materials at https://github.com/ul-mds/Progression-of-Leukodistrophy.</w:t>
-      </w:r>
-    </w:p>
-    <w:p/>
-    <w:p>
-      <w:r>
-        <w:rPr>
-          <w:rFonts w:ascii="Times New Roman" w:hAnsi="Times New Roman"/>
-          <w:b/>
-          <w:sz w:val="24"/>
-        </w:rPr>
-        <w:t>Clinical authorship and expertise</w:t>
+        <w:t>In a retrospective cohort of 146 men with a myelopathic onset, 65 had cerebral ALD at the first dated visit. Among 67 men without cerebral ALD at entry and with follow-up (median 86 months; 20 conversion events), the cumulative incidence of a first physician-recorded cerebral ALD event was 6.5% at 3 years, 10.2% at 5 years, and 24.3% (95% CI 13.8 to 40.7) at 10 years. Baseline clinical and HPO-coded features did not identify converters after adjustment for multiple testing. We relate these estimates to earlier cohorts and emphasise that the analyses are exploratory; magnetic resonance imaging surveillance remains the standard for detecting cerebral disease.</w:t>
       </w:r>
     </w:p>
     <w:p>
@@ -119,18 +63,7 @@
           <w:rFonts w:ascii="Times New Roman" w:hAnsi="Times New Roman"/>
           <w:sz w:val="24"/>
         </w:rPr>
-        <w:t>The grouping reflects long-standing clinical phenotyping practice at our centre. Professor Wolfgang Köhler, who co-developed the dataset and supervised its clinical content, has dedicated his career to the diagnosis and longitudinal care of leukodystrophy and was among the physicians involved in the early clinical recognition of these disorders in adult neurology. His contribution ensures that the ontology mapping remains anchored in bedside examination and registry practice rather than in automated coding alone.</w:t>
-      </w:r>
-    </w:p>
-    <w:p/>
-    <w:p>
-      <w:r>
-        <w:rPr>
-          <w:rFonts w:ascii="Times New Roman" w:hAnsi="Times New Roman"/>
-          <w:b/>
-          <w:sz w:val="24"/>
-        </w:rPr>
-        <w:t>Reporting and transparency</w:t>
+        <w:t>A central element of the paper is an original HPO Symptom Grouping Dataset (Online Resource 1), developed by the clinical authors for this study. It maps 135 registry examination items to 133 distinct HPO terms in myelopathic and cerebral subgroups with neuroanatomical localisation. To our knowledge, standardised HPO-coded phenotypes have not previously been used to study progression from myeloneuropathy to cerebral disease in leukodystrophy. The dataset and submission materials are available at https://github.com/ul-mds/Progression-of-Leukodistrophy.</w:t>
       </w:r>
     </w:p>
     <w:p>
@@ -139,28 +72,7 @@
           <w:rFonts w:ascii="Times New Roman" w:hAnsi="Times New Roman"/>
           <w:sz w:val="24"/>
         </w:rPr>
-        <w:t>We report the study according to the STROBE and RECORD statements. Registry governance, data availability, and the separation of this analysis from an earlier exploratory modelling exercise on the same registry are described in the manuscript. Competing interests and funding are declared in full.</w:t>
-      </w:r>
-    </w:p>
-    <w:p/>
-    <w:p>
-      <w:r>
-        <w:rPr>
-          <w:rFonts w:ascii="Times New Roman" w:hAnsi="Times New Roman"/>
-          <w:sz w:val="24"/>
-        </w:rPr>
-        <w:t>We believe the manuscript will interest clinicians who manage X-ALD and related leukodystrophies, as well as investigators building registry-based natural history and interoperable phenotype data. We would be grateful for your consideration.</w:t>
-      </w:r>
-    </w:p>
-    <w:p/>
-    <w:p>
-      <w:r>
-        <w:rPr>
-          <w:rFonts w:ascii="Times New Roman" w:hAnsi="Times New Roman"/>
-          <w:b/>
-          <w:sz w:val="24"/>
-        </w:rPr>
-        <w:t>Suggested reviewers (optional; institutional e-mail addresses available on request):</w:t>
+        <w:t>The clinical mapping reflects phenotyping practice at our centre. Professor Wolfgang Köhler, who co-developed the dataset, has long-standing expertise in the diagnosis and longitudinal care of leukodystrophy, including early clinical characterisation of these disorders in adult neurology. The study is reported according to the STROBE and RECORD statements; funding, competing interests, data availability, and the distinction between this analysis and an earlier exploratory registry exercise are documented in the manuscript.</w:t>
       </w:r>
     </w:p>
     <w:p>
@@ -169,34 +81,32 @@
           <w:rFonts w:ascii="Times New Roman" w:hAnsi="Times New Roman"/>
           <w:sz w:val="24"/>
         </w:rPr>
-        <w:t>Independent experts in X-ALD natural history, leukodystrophy registries, and HPO-based clinical data standards would be suitable.</w:t>
+        <w:t>We respectfully suggest that the work will be of interest to clinicians and researchers concerned with X-ALD, leukodystrophy registries, and interoperable clinical phenotype data. We would be grateful if you could arrange peer review. Institutional e-mail addresses for suggested reviewers can be provided on request.</w:t>
       </w:r>
     </w:p>
-    <w:p/>
     <w:p>
       <w:r>
         <w:rPr>
           <w:rFonts w:ascii="Times New Roman" w:hAnsi="Times New Roman"/>
           <w:sz w:val="24"/>
         </w:rPr>
-        <w:t>Thank you for your time.</w:t>
+        <w:t>Thank you for your consideration.</w:t>
       </w:r>
     </w:p>
-    <w:p/>
     <w:p>
       <w:r>
         <w:rPr>
           <w:rFonts w:ascii="Times New Roman" w:hAnsi="Times New Roman"/>
           <w:sz w:val="24"/>
         </w:rPr>
-        <w:t>Sincerely,</w:t>
+        <w:t>Yours sincerely,</w:t>
       </w:r>
     </w:p>
-    <w:p/>
     <w:p>
       <w:r>
         <w:rPr>
           <w:rFonts w:ascii="Times New Roman" w:hAnsi="Times New Roman"/>
+          <w:b/>
           <w:sz w:val="24"/>
         </w:rPr>
         <w:t>Senol Dogan, PhD</w:t>
@@ -256,7 +166,6 @@
         <w:t>ORCID: 0000-0001-7358-4850</w:t>
       </w:r>
     </w:p>
-    <w:p/>
     <w:p>
       <w:r>
         <w:rPr>
@@ -275,6 +184,7 @@
         <w:t>Wolfgang Köhler, Caroline Bergner, Julia Lier, Sina Sadeghi, Toralf Kirsten</w:t>
       </w:r>
     </w:p>
+    <w:p/>
     <w:sectPr>
       <w:pgSz w:w="12240" w:h="15840"/>
       <w:pgMar w:top="1440" w:right="1440" w:bottom="1440" w:left="1440" w:header="720" w:footer="720" w:gutter="0"/>

</xml_diff>

<commit_message>
Restore cover letter logos and Relevant experience author section.
</commit_message>
<xml_diff>
--- a/JNeurol_submission/Cover_letter.docx
+++ b/JNeurol_submission/Cover_letter.docx
@@ -2,10 +2,257 @@
 <file path=word/document.xml><?xml version="1.0" encoding="utf-8"?>
 <w:document xmlns:wpc="http://schemas.microsoft.com/office/word/2010/wordprocessingCanvas" xmlns:mo="http://schemas.microsoft.com/office/mac/office/2008/main" xmlns:mc="http://schemas.openxmlformats.org/markup-compatibility/2006" xmlns:mv="urn:schemas-microsoft-com:mac:vml" xmlns:o="urn:schemas-microsoft-com:office:office" xmlns:r="http://schemas.openxmlformats.org/officeDocument/2006/relationships" xmlns:m="http://schemas.openxmlformats.org/officeDocument/2006/math" xmlns:v="urn:schemas-microsoft-com:vml" xmlns:wp14="http://schemas.microsoft.com/office/word/2010/wordprocessingDrawing" xmlns:wp="http://schemas.openxmlformats.org/drawingml/2006/wordprocessingDrawing" xmlns:w10="urn:schemas-microsoft-com:office:word" xmlns:w="http://schemas.openxmlformats.org/wordprocessingml/2006/main" xmlns:w14="http://schemas.microsoft.com/office/word/2010/wordml" xmlns:wpg="http://schemas.microsoft.com/office/word/2010/wordprocessingGroup" xmlns:wpi="http://schemas.microsoft.com/office/word/2010/wordprocessingInk" xmlns:wne="http://schemas.microsoft.com/office/word/2006/wordml" xmlns:wps="http://schemas.microsoft.com/office/word/2010/wordprocessingShape" mc:Ignorable="w14 wp14">
   <w:body>
+    <w:tbl>
+      <w:tblPr>
+        <w:tblW w:type="auto" w:w="0"/>
+        <w:jc w:val="center"/>
+        <w:tblLook w:firstColumn="1" w:firstRow="1" w:lastColumn="0" w:lastRow="0" w:noHBand="0" w:noVBand="1" w:val="04A0"/>
+      </w:tblPr>
+      <w:tblGrid>
+        <w:gridCol w:w="2160"/>
+        <w:gridCol w:w="2160"/>
+        <w:gridCol w:w="2160"/>
+        <w:gridCol w:w="2160"/>
+      </w:tblGrid>
+      <w:tr>
+        <w:tc>
+          <w:tcPr>
+            <w:tcW w:type="dxa" w:w="2160"/>
+          </w:tcPr>
+          <w:p>
+            <w:pPr>
+              <w:jc w:val="center"/>
+            </w:pPr>
+            <w:r>
+              <w:drawing>
+                <wp:inline xmlns:a="http://schemas.openxmlformats.org/drawingml/2006/main" xmlns:pic="http://schemas.openxmlformats.org/drawingml/2006/picture">
+                  <wp:extent cx="1234440" cy="399448"/>
+                  <wp:docPr id="1" name="Picture 1"/>
+                  <wp:cNvGraphicFramePr>
+                    <a:graphicFrameLocks noChangeAspect="1"/>
+                  </wp:cNvGraphicFramePr>
+                  <a:graphic>
+                    <a:graphicData uri="http://schemas.openxmlformats.org/drawingml/2006/picture">
+                      <pic:pic>
+                        <pic:nvPicPr>
+                          <pic:cNvPr id="0" name="cover_logo_1.png"/>
+                          <pic:cNvPicPr/>
+                        </pic:nvPicPr>
+                        <pic:blipFill>
+                          <a:blip r:embed="rId9"/>
+                          <a:stretch>
+                            <a:fillRect/>
+                          </a:stretch>
+                        </pic:blipFill>
+                        <pic:spPr>
+                          <a:xfrm>
+                            <a:off x="0" y="0"/>
+                            <a:ext cx="1234440" cy="399448"/>
+                          </a:xfrm>
+                          <a:prstGeom prst="rect"/>
+                        </pic:spPr>
+                      </pic:pic>
+                    </a:graphicData>
+                  </a:graphic>
+                </wp:inline>
+              </w:drawing>
+            </w:r>
+          </w:p>
+        </w:tc>
+        <w:tc>
+          <w:tcPr>
+            <w:tcW w:type="dxa" w:w="2160"/>
+          </w:tcPr>
+          <w:p>
+            <w:pPr>
+              <w:jc w:val="center"/>
+            </w:pPr>
+            <w:r>
+              <w:drawing>
+                <wp:inline xmlns:a="http://schemas.openxmlformats.org/drawingml/2006/main" xmlns:pic="http://schemas.openxmlformats.org/drawingml/2006/picture">
+                  <wp:extent cx="1234440" cy="473998"/>
+                  <wp:docPr id="2" name="Picture 2"/>
+                  <wp:cNvGraphicFramePr>
+                    <a:graphicFrameLocks noChangeAspect="1"/>
+                  </wp:cNvGraphicFramePr>
+                  <a:graphic>
+                    <a:graphicData uri="http://schemas.openxmlformats.org/drawingml/2006/picture">
+                      <pic:pic>
+                        <pic:nvPicPr>
+                          <pic:cNvPr id="0" name="cover_logo_2.png"/>
+                          <pic:cNvPicPr/>
+                        </pic:nvPicPr>
+                        <pic:blipFill>
+                          <a:blip r:embed="rId10"/>
+                          <a:stretch>
+                            <a:fillRect/>
+                          </a:stretch>
+                        </pic:blipFill>
+                        <pic:spPr>
+                          <a:xfrm>
+                            <a:off x="0" y="0"/>
+                            <a:ext cx="1234440" cy="473998"/>
+                          </a:xfrm>
+                          <a:prstGeom prst="rect"/>
+                        </pic:spPr>
+                      </pic:pic>
+                    </a:graphicData>
+                  </a:graphic>
+                </wp:inline>
+              </w:drawing>
+            </w:r>
+          </w:p>
+        </w:tc>
+        <w:tc>
+          <w:tcPr>
+            <w:tcW w:type="dxa" w:w="2160"/>
+          </w:tcPr>
+          <w:p>
+            <w:pPr>
+              <w:jc w:val="center"/>
+            </w:pPr>
+            <w:r>
+              <w:drawing>
+                <wp:inline xmlns:a="http://schemas.openxmlformats.org/drawingml/2006/main" xmlns:pic="http://schemas.openxmlformats.org/drawingml/2006/picture">
+                  <wp:extent cx="1234440" cy="316986"/>
+                  <wp:docPr id="3" name="Picture 3"/>
+                  <wp:cNvGraphicFramePr>
+                    <a:graphicFrameLocks noChangeAspect="1"/>
+                  </wp:cNvGraphicFramePr>
+                  <a:graphic>
+                    <a:graphicData uri="http://schemas.openxmlformats.org/drawingml/2006/picture">
+                      <pic:pic>
+                        <pic:nvPicPr>
+                          <pic:cNvPr id="0" name="cover_logo_3.png"/>
+                          <pic:cNvPicPr/>
+                        </pic:nvPicPr>
+                        <pic:blipFill>
+                          <a:blip r:embed="rId11"/>
+                          <a:stretch>
+                            <a:fillRect/>
+                          </a:stretch>
+                        </pic:blipFill>
+                        <pic:spPr>
+                          <a:xfrm>
+                            <a:off x="0" y="0"/>
+                            <a:ext cx="1234440" cy="316986"/>
+                          </a:xfrm>
+                          <a:prstGeom prst="rect"/>
+                        </pic:spPr>
+                      </pic:pic>
+                    </a:graphicData>
+                  </a:graphic>
+                </wp:inline>
+              </w:drawing>
+            </w:r>
+          </w:p>
+        </w:tc>
+        <w:tc>
+          <w:tcPr>
+            <w:tcW w:type="dxa" w:w="2160"/>
+          </w:tcPr>
+          <w:p>
+            <w:pPr>
+              <w:jc w:val="center"/>
+            </w:pPr>
+            <w:r>
+              <w:drawing>
+                <wp:inline xmlns:a="http://schemas.openxmlformats.org/drawingml/2006/main" xmlns:pic="http://schemas.openxmlformats.org/drawingml/2006/picture">
+                  <wp:extent cx="1234440" cy="335613"/>
+                  <wp:docPr id="4" name="Picture 4"/>
+                  <wp:cNvGraphicFramePr>
+                    <a:graphicFrameLocks noChangeAspect="1"/>
+                  </wp:cNvGraphicFramePr>
+                  <a:graphic>
+                    <a:graphicData uri="http://schemas.openxmlformats.org/drawingml/2006/picture">
+                      <pic:pic>
+                        <pic:nvPicPr>
+                          <pic:cNvPr id="0" name="cover_logo_4.png"/>
+                          <pic:cNvPicPr/>
+                        </pic:nvPicPr>
+                        <pic:blipFill>
+                          <a:blip r:embed="rId12"/>
+                          <a:stretch>
+                            <a:fillRect/>
+                          </a:stretch>
+                        </pic:blipFill>
+                        <pic:spPr>
+                          <a:xfrm>
+                            <a:off x="0" y="0"/>
+                            <a:ext cx="1234440" cy="335613"/>
+                          </a:xfrm>
+                          <a:prstGeom prst="rect"/>
+                        </pic:spPr>
+                      </pic:pic>
+                    </a:graphicData>
+                  </a:graphic>
+                </wp:inline>
+              </w:drawing>
+            </w:r>
+          </w:p>
+        </w:tc>
+      </w:tr>
+    </w:tbl>
+    <w:p/>
     <w:p>
       <w:r>
         <w:rPr>
           <w:rFonts w:ascii="Times New Roman" w:hAnsi="Times New Roman"/>
+          <w:b w:val="0"/>
+          <w:i w:val="0"/>
+          <w:sz w:val="24"/>
+        </w:rPr>
+        <w:t>14 October 2026</w:t>
+      </w:r>
+    </w:p>
+    <w:p>
+      <w:r>
+        <w:rPr>
+          <w:rFonts w:ascii="Times New Roman" w:hAnsi="Times New Roman"/>
+          <w:b w:val="0"/>
+          <w:i w:val="0"/>
+          <w:sz w:val="24"/>
+        </w:rPr>
+      </w:r>
+    </w:p>
+    <w:p>
+      <w:r>
+        <w:rPr>
+          <w:rFonts w:ascii="Times New Roman" w:hAnsi="Times New Roman"/>
+          <w:b w:val="0"/>
+          <w:i w:val="0"/>
+          <w:sz w:val="24"/>
+        </w:rPr>
+        <w:t>Editor-in-Chief</w:t>
+      </w:r>
+    </w:p>
+    <w:p>
+      <w:r>
+        <w:rPr>
+          <w:rFonts w:ascii="Times New Roman" w:hAnsi="Times New Roman"/>
+          <w:b w:val="0"/>
+          <w:i w:val="0"/>
+          <w:sz w:val="24"/>
+        </w:rPr>
+        <w:t>Journal of Neurology</w:t>
+      </w:r>
+    </w:p>
+    <w:p>
+      <w:r>
+        <w:rPr>
+          <w:rFonts w:ascii="Times New Roman" w:hAnsi="Times New Roman"/>
+          <w:b w:val="0"/>
+          <w:i w:val="0"/>
+          <w:sz w:val="24"/>
+        </w:rPr>
+      </w:r>
+    </w:p>
+    <w:p>
+      <w:r>
+        <w:rPr>
+          <w:rFonts w:ascii="Times New Roman" w:hAnsi="Times New Roman"/>
+          <w:b w:val="0"/>
+          <w:i w:val="0"/>
           <w:sz w:val="24"/>
         </w:rPr>
         <w:t>Dear Editor-in-Chief,</w:t>
@@ -15,6 +262,18 @@
       <w:r>
         <w:rPr>
           <w:rFonts w:ascii="Times New Roman" w:hAnsi="Times New Roman"/>
+          <w:b w:val="0"/>
+          <w:i w:val="0"/>
+          <w:sz w:val="24"/>
+        </w:rPr>
+      </w:r>
+    </w:p>
+    <w:p>
+      <w:r>
+        <w:rPr>
+          <w:rFonts w:ascii="Times New Roman" w:hAnsi="Times New Roman"/>
+          <w:b w:val="0"/>
+          <w:i w:val="0"/>
           <w:sz w:val="24"/>
         </w:rPr>
         <w:t>Please consider the enclosed manuscript for publication as an Original Communication in the Journal of Neurology.</w:t>
@@ -25,6 +284,7 @@
         <w:rPr>
           <w:rFonts w:ascii="Times New Roman" w:hAnsi="Times New Roman"/>
           <w:b/>
+          <w:i w:val="0"/>
           <w:sz w:val="24"/>
         </w:rPr>
         <w:t>Title: Progression from myeloneuropathy to cerebral disease in men with X-linked adrenoleukodystrophy studied using a Human Phenotype Ontology-based approach</w:t>
@@ -34,6 +294,8 @@
       <w:r>
         <w:rPr>
           <w:rFonts w:ascii="Times New Roman" w:hAnsi="Times New Roman"/>
+          <w:b w:val="0"/>
+          <w:i w:val="0"/>
           <w:sz w:val="24"/>
         </w:rPr>
         <w:t>The manuscript has not been published elsewhere and is not under consideration by another journal. All authors have read and approved the final version and agree with its submission.</w:t>
@@ -43,6 +305,18 @@
       <w:r>
         <w:rPr>
           <w:rFonts w:ascii="Times New Roman" w:hAnsi="Times New Roman"/>
+          <w:b w:val="0"/>
+          <w:i w:val="0"/>
+          <w:sz w:val="24"/>
+        </w:rPr>
+      </w:r>
+    </w:p>
+    <w:p>
+      <w:r>
+        <w:rPr>
+          <w:rFonts w:ascii="Times New Roman" w:hAnsi="Times New Roman"/>
+          <w:b w:val="0"/>
+          <w:i w:val="0"/>
           <w:sz w:val="24"/>
         </w:rPr>
         <w:t>Men with X-linked adrenoleukodystrophy (X-ALD) may remain on a myeloneuropathic trajectory for years before inflammatory cerebral adrenoleukodystrophy (cerebral ALD) is recognised. In clinical practice, estimates of when and how often this transition occurs remain inconsistent, which complicates counselling and the design of surveillance and natural history studies. We address this question using longitudinal data from the Leipzig leukodystrophy registry (REDCap), a setting in which neurologists record disease manifestation and Human Phenotype Ontology (HPO)-coded examination findings at repeated visits.</w:t>
@@ -52,6 +326,8 @@
       <w:r>
         <w:rPr>
           <w:rFonts w:ascii="Times New Roman" w:hAnsi="Times New Roman"/>
+          <w:b w:val="0"/>
+          <w:i w:val="0"/>
           <w:sz w:val="24"/>
         </w:rPr>
         <w:t>In a retrospective cohort of 146 men with a myelopathic onset, 65 had cerebral ALD at the first dated visit. Among 67 men without cerebral ALD at entry and with follow-up (median 86 months; 20 conversion events), the cumulative incidence of a first physician-recorded cerebral ALD event was 6.5% at 3 years, 10.2% at 5 years, and 24.3% (95% CI 13.8 to 40.7) at 10 years. Baseline clinical and HPO-coded features did not identify converters after adjustment for multiple testing. We relate these estimates to earlier cohorts and emphasise that the analyses are exploratory; magnetic resonance imaging surveillance remains the standard for detecting cerebral disease.</w:t>
@@ -61,6 +337,8 @@
       <w:r>
         <w:rPr>
           <w:rFonts w:ascii="Times New Roman" w:hAnsi="Times New Roman"/>
+          <w:b w:val="0"/>
+          <w:i w:val="0"/>
           <w:sz w:val="24"/>
         </w:rPr>
         <w:t>A central element of the paper is an original HPO Symptom Grouping Dataset (Online Resource 1), developed by the clinical authors for this study. It maps 135 registry examination items to 133 distinct HPO terms in myelopathic and cerebral subgroups with neuroanatomical localisation. To our knowledge, standardised HPO-coded phenotypes have not previously been used to study progression from myeloneuropathy to cerebral disease in leukodystrophy. The dataset and submission materials are available at https://github.com/ul-mds/Progression-of-Leukodistrophy.</w:t>
@@ -70,6 +348,8 @@
       <w:r>
         <w:rPr>
           <w:rFonts w:ascii="Times New Roman" w:hAnsi="Times New Roman"/>
+          <w:b w:val="0"/>
+          <w:i w:val="0"/>
           <w:sz w:val="24"/>
         </w:rPr>
         <w:t>The clinical mapping reflects phenotyping practice at our centre. Professor Wolfgang Köhler, who co-developed the dataset, has long-standing expertise in the diagnosis and longitudinal care of leukodystrophy, including early clinical characterisation of these disorders in adult neurology. The study is reported according to the STROBE and RECORD statements; funding, competing interests, data availability, and the distinction between this analysis and an earlier exploratory registry exercise are documented in the manuscript.</w:t>
@@ -79,6 +359,18 @@
       <w:r>
         <w:rPr>
           <w:rFonts w:ascii="Times New Roman" w:hAnsi="Times New Roman"/>
+          <w:b w:val="0"/>
+          <w:i w:val="0"/>
+          <w:sz w:val="24"/>
+        </w:rPr>
+      </w:r>
+    </w:p>
+    <w:p>
+      <w:r>
+        <w:rPr>
+          <w:rFonts w:ascii="Times New Roman" w:hAnsi="Times New Roman"/>
+          <w:b w:val="0"/>
+          <w:i w:val="0"/>
           <w:sz w:val="24"/>
         </w:rPr>
         <w:t>We respectfully suggest that the work will be of interest to clinicians and researchers concerned with X-ALD, leukodystrophy registries, and interoperable clinical phenotype data. We would be grateful if you could arrange peer review. Institutional e-mail addresses for suggested reviewers can be provided on request.</w:t>
@@ -88,6 +380,18 @@
       <w:r>
         <w:rPr>
           <w:rFonts w:ascii="Times New Roman" w:hAnsi="Times New Roman"/>
+          <w:b w:val="0"/>
+          <w:i w:val="0"/>
+          <w:sz w:val="24"/>
+        </w:rPr>
+      </w:r>
+    </w:p>
+    <w:p>
+      <w:r>
+        <w:rPr>
+          <w:rFonts w:ascii="Times New Roman" w:hAnsi="Times New Roman"/>
+          <w:b w:val="0"/>
+          <w:i w:val="0"/>
           <w:sz w:val="24"/>
         </w:rPr>
         <w:t>Thank you for your consideration.</w:t>
@@ -97,6 +401,18 @@
       <w:r>
         <w:rPr>
           <w:rFonts w:ascii="Times New Roman" w:hAnsi="Times New Roman"/>
+          <w:b w:val="0"/>
+          <w:i w:val="0"/>
+          <w:sz w:val="24"/>
+        </w:rPr>
+      </w:r>
+    </w:p>
+    <w:p>
+      <w:r>
+        <w:rPr>
+          <w:rFonts w:ascii="Times New Roman" w:hAnsi="Times New Roman"/>
+          <w:b w:val="0"/>
+          <w:i w:val="0"/>
           <w:sz w:val="24"/>
         </w:rPr>
         <w:t>Yours sincerely,</w:t>
@@ -106,7 +422,18 @@
       <w:r>
         <w:rPr>
           <w:rFonts w:ascii="Times New Roman" w:hAnsi="Times New Roman"/>
+          <w:b w:val="0"/>
+          <w:i w:val="0"/>
+          <w:sz w:val="24"/>
+        </w:rPr>
+      </w:r>
+    </w:p>
+    <w:p>
+      <w:r>
+        <w:rPr>
+          <w:rFonts w:ascii="Times New Roman" w:hAnsi="Times New Roman"/>
           <w:b/>
+          <w:i w:val="0"/>
           <w:sz w:val="24"/>
         </w:rPr>
         <w:t>Senol Dogan, PhD</w:t>
@@ -116,6 +443,8 @@
       <w:r>
         <w:rPr>
           <w:rFonts w:ascii="Times New Roman" w:hAnsi="Times New Roman"/>
+          <w:b w:val="0"/>
+          <w:i w:val="0"/>
           <w:sz w:val="24"/>
         </w:rPr>
         <w:t>Corresponding author</w:t>
@@ -125,6 +454,8 @@
       <w:r>
         <w:rPr>
           <w:rFonts w:ascii="Times New Roman" w:hAnsi="Times New Roman"/>
+          <w:b w:val="0"/>
+          <w:i w:val="0"/>
           <w:sz w:val="24"/>
         </w:rPr>
         <w:t>Institute for Medical Informatics, Statistics and Epidemiology</w:t>
@@ -134,6 +465,8 @@
       <w:r>
         <w:rPr>
           <w:rFonts w:ascii="Times New Roman" w:hAnsi="Times New Roman"/>
+          <w:b w:val="0"/>
+          <w:i w:val="0"/>
           <w:sz w:val="24"/>
         </w:rPr>
         <w:t>Medical Faculty, Leipzig University</w:t>
@@ -143,6 +476,8 @@
       <w:r>
         <w:rPr>
           <w:rFonts w:ascii="Times New Roman" w:hAnsi="Times New Roman"/>
+          <w:b w:val="0"/>
+          <w:i w:val="0"/>
           <w:sz w:val="24"/>
         </w:rPr>
         <w:t>Härtelstr. 16–18, 04107 Leipzig, Germany</w:t>
@@ -152,6 +487,8 @@
       <w:r>
         <w:rPr>
           <w:rFonts w:ascii="Times New Roman" w:hAnsi="Times New Roman"/>
+          <w:b w:val="0"/>
+          <w:i w:val="0"/>
           <w:sz w:val="24"/>
         </w:rPr>
         <w:t>Senol.Dogan@medizin.uni-leipzig.de</w:t>
@@ -161,6 +498,8 @@
       <w:r>
         <w:rPr>
           <w:rFonts w:ascii="Times New Roman" w:hAnsi="Times New Roman"/>
+          <w:b w:val="0"/>
+          <w:i w:val="0"/>
           <w:sz w:val="24"/>
         </w:rPr>
         <w:t>ORCID: 0000-0001-7358-4850</w:t>
@@ -170,6 +509,18 @@
       <w:r>
         <w:rPr>
           <w:rFonts w:ascii="Times New Roman" w:hAnsi="Times New Roman"/>
+          <w:b w:val="0"/>
+          <w:i w:val="0"/>
+          <w:sz w:val="24"/>
+        </w:rPr>
+      </w:r>
+    </w:p>
+    <w:p>
+      <w:r>
+        <w:rPr>
+          <w:rFonts w:ascii="Times New Roman" w:hAnsi="Times New Roman"/>
+          <w:b w:val="0"/>
+          <w:i w:val="0"/>
           <w:sz w:val="24"/>
         </w:rPr>
         <w:t>On behalf of all co-authors:</w:t>
@@ -179,12 +530,100 @@
       <w:r>
         <w:rPr>
           <w:rFonts w:ascii="Times New Roman" w:hAnsi="Times New Roman"/>
+          <w:b w:val="0"/>
+          <w:i w:val="0"/>
           <w:sz w:val="24"/>
         </w:rPr>
         <w:t>Wolfgang Köhler, Caroline Bergner, Julia Lier, Sina Sadeghi, Toralf Kirsten</w:t>
       </w:r>
     </w:p>
-    <w:p/>
+    <w:p>
+      <w:r>
+        <w:rPr>
+          <w:rFonts w:ascii="Times New Roman" w:hAnsi="Times New Roman"/>
+          <w:b w:val="0"/>
+          <w:i w:val="0"/>
+          <w:sz w:val="24"/>
+        </w:rPr>
+      </w:r>
+    </w:p>
+    <w:p>
+      <w:r>
+        <w:rPr>
+          <w:rFonts w:ascii="Times New Roman" w:hAnsi="Times New Roman"/>
+          <w:b/>
+          <w:i w:val="0"/>
+          <w:sz w:val="24"/>
+        </w:rPr>
+        <w:t>Relevant experience</w:t>
+      </w:r>
+    </w:p>
+    <w:p>
+      <w:r>
+        <w:rPr>
+          <w:rFonts w:ascii="Times New Roman" w:hAnsi="Times New Roman"/>
+          <w:b w:val="0"/>
+          <w:i w:val="0"/>
+          <w:sz w:val="24"/>
+        </w:rPr>
+        <w:t>Senol Dogan. He is a bioinformatician and biostatistician in the Department for Medical Data Science at Leipzig University, with a doctorate in genetics and bioengineering. For this manuscript he designed the analysis, performed the statistical work, and wrote the first draft. He is the corresponding author.</w:t>
+      </w:r>
+    </w:p>
+    <w:p>
+      <w:r>
+        <w:rPr>
+          <w:rFonts w:ascii="Times New Roman" w:hAnsi="Times New Roman"/>
+          <w:b w:val="0"/>
+          <w:i w:val="0"/>
+          <w:sz w:val="24"/>
+        </w:rPr>
+        <w:t>Toralf Kirsten. He is Professor of Medical Data Science at Leipzig University. His research concerns the analysis of clinical registry data in rare neurological disease. He supervised the project and revised the manuscript.</w:t>
+      </w:r>
+    </w:p>
+    <w:p>
+      <w:r>
+        <w:rPr>
+          <w:rFonts w:ascii="Times New Roman" w:hAnsi="Times New Roman"/>
+          <w:b w:val="0"/>
+          <w:i w:val="0"/>
+          <w:sz w:val="24"/>
+        </w:rPr>
+        <w:t>Wolfgang Köhler. He is a neurologist at Leipzig University Medical Center and head of the leukodystrophy clinic at the Myelin Centre. He cares for adults with leukodystrophy, co-developed the HPO Symptom Grouping Dataset for this study, and contributed long-standing clinical expertise in phenotyping and natural history. He was among the physicians involved in the early clinical recognition of leukodystrophy in adult neurology.</w:t>
+      </w:r>
+    </w:p>
+    <w:p>
+      <w:r>
+        <w:rPr>
+          <w:rFonts w:ascii="Times New Roman" w:hAnsi="Times New Roman"/>
+          <w:b w:val="0"/>
+          <w:i w:val="0"/>
+          <w:sz w:val="24"/>
+        </w:rPr>
+        <w:t>Caroline Bergner. She is a neurologist at Leipzig University Medical Center. She leads the Leukodystrophy Laboratory and the adult leukodystrophy outpatient clinic. Her research concerns how hereditary leukodystrophies present in adults. She helped to interpret the data and revised the manuscript.</w:t>
+      </w:r>
+    </w:p>
+    <w:p>
+      <w:r>
+        <w:rPr>
+          <w:rFonts w:ascii="Times New Roman" w:hAnsi="Times New Roman"/>
+          <w:b w:val="0"/>
+          <w:i w:val="0"/>
+          <w:sz w:val="24"/>
+        </w:rPr>
+        <w:t>Julia Lier. She is a clinician scientist in the Leukodystrophy Laboratory and a physician in the Department of Neurology at Leipzig. She works with adults who have leukodystrophy and contributed to the clinical interpretation of the registry phenotypes used here.</w:t>
+      </w:r>
+    </w:p>
+    <w:p>
+      <w:r>
+        <w:rPr>
+          <w:rFonts w:ascii="Times New Roman" w:hAnsi="Times New Roman"/>
+          <w:b w:val="0"/>
+          <w:i w:val="0"/>
+          <w:sz w:val="24"/>
+        </w:rPr>
+        <w:t>Sina Sadeghi. She is a researcher in medical data science at Leipzig University. She contributed to the analysis and revised the manuscript.</w:t>
+      </w:r>
+    </w:p>
     <w:sectPr>
       <w:pgSz w:w="12240" w:h="15840"/>
       <w:pgMar w:top="1440" w:right="1440" w:bottom="1440" w:left="1440" w:header="720" w:footer="720" w:gutter="0"/>

</xml_diff>